<commit_message>
added apendices Ethics and Declaration of Originality
</commit_message>
<xml_diff>
--- a/docs/MSc_DSHSC_dissertation_title_page.docx
+++ b/docs/MSc_DSHSC_dissertation_title_page.docx
@@ -16,7 +16,7 @@
           <w:noProof/>
         </w:rPr>
         <w:drawing>
-          <wp:inline distT="0" distB="0" distL="0" distR="0" wp14:anchorId="0E445B27" wp14:editId="19F718D1">
+          <wp:inline distT="0" distB="0" distL="0" distR="0" wp14:anchorId="0E445B27" wp14:editId="2F940820">
             <wp:extent cx="4711700" cy="1073150"/>
             <wp:effectExtent l="0" t="0" r="0" b="0"/>
             <wp:docPr id="1" name="Picture 1"/>
@@ -244,7 +244,14 @@
           <w:sz w:val="32"/>
           <w:szCs w:val="32"/>
         </w:rPr>
-        <w:t>25000</w:t>
+        <w:t>10</w:t>
+      </w:r>
+      <w:r>
+        <w:rPr>
+          <w:sz w:val="32"/>
+          <w:szCs w:val="32"/>
+        </w:rPr>
+        <w:t>000</w:t>
       </w:r>
     </w:p>
     <w:p>

</xml_diff>